<commit_message>
Añade base de datos solo con datos del Registro de Transparencia
- eu_lobbying.db: tablas del Registro (variables [TR]); sin actividad, emparejamientos ni clasificaciones propias
- LEEME: sección 4.8 sobre el contenido de la base y el cruce con la actividad
- CSV de actividad: register_id_in_source, match_method, procedure_declared, meeting_row

Co-Authored-By: Claude Opus 5.5 <noreply@anthropic.com>
</commit_message>
<xml_diff>
--- a/0_LEEME_Metodologia_lobbistas.docx
+++ b/0_LEEME_Metodologia_lobbistas.docx
@@ -235,7 +235,7 @@
               <w:rPr>
                 <w:sz w:val="18"/>
               </w:rPr>
-              <w:t>Base completa (SQLite) con todas las tablas; se abre con DB Browser for SQLite, R (RSQLite), Python o Stata (odbc).</w:t>
+              <w:t>Base de datos (SQLite) solo con la información del Registro de Transparencia (ver 4.8). Se abre con DB Browser for SQLite, R (RSQLite), Python o Stata (odbc).</w:t>
             </w:r>
           </w:p>
         </w:tc>
@@ -1683,7 +1683,7 @@
         <w:spacing w:after="80"/>
       </w:pPr>
       <w:r>
-        <w:t>Procedimiento declarado: el que indica el eurodiputado al publicar la reunión (procedure_source = declared).</w:t>
+        <w:t>Procedimiento declarado: el que indica el eurodiputado al publicar la reunión (procedure_source = declared; columna procedure_declared del CSV de reuniones).</w:t>
       </w:r>
     </w:p>
     <w:p>
@@ -1781,6 +1781,297 @@
       </w:pPr>
       <w:r>
         <w:t>Se descargaron los adjuntos de las respuestas a consultas de las leyes de la muestra: todos los de lobbistas que se reunieron con eurodiputados sobre la ley (grupo «treated» en el índice) y los de lobbistas sin reuniones (grupo «control»: una muestra por ley y, para los documentos sobre la propuesta publicada, todos). El texto se extrajo con pypdf (PDF) y python-docx (Word); los PDF escaneados como imagen no tienen texto.</w:t>
+      </w:r>
+    </w:p>
+    <w:p>
+      <w:pPr>
+        <w:pStyle w:val="Heading2"/>
+        <w:spacing w:after="80"/>
+      </w:pPr>
+      <w:r>
+        <w:t>4.8 Contenido de la base de datos y cruce con la actividad</w:t>
+      </w:r>
+    </w:p>
+    <w:p>
+      <w:pPr>
+        <w:spacing w:after="80"/>
+      </w:pPr>
+      <w:r>
+        <w:t>Criterio: la base de datos (5_base_datos/eu_lobbying.db) contiene solo información tomada de las exportaciones oficiales del Registro de Transparencia (variables marcadas [TR] en codebook_lobbyists.csv). Quedan fuera las reuniones, las consultas, las leyes, las identificaciones de nombres, los participantes no registrados, el LEI y las matrices (GLEIF), el tipo de lobby (4.2), los recuentos de actividad (4.5) y las organizaciones cuyo número solo se vio en reuniones o consultas (sin categoría en el Registro). Todo ello sigue disponible en las carpetas 1 a 4 y en resumen_lobbistas.xlsx.</w:t>
+      </w:r>
+    </w:p>
+    <w:tbl>
+      <w:tblPr>
+        <w:tblStyle w:val="LightGrid-Accent1"/>
+        <w:tblW w:type="auto" w:w="0"/>
+        <w:tblLook w:firstColumn="1" w:firstRow="1" w:lastColumn="0" w:lastRow="0" w:noHBand="0" w:noVBand="1" w:val="04A0"/>
+      </w:tblPr>
+      <w:tblGrid>
+        <w:gridCol w:w="2880"/>
+        <w:gridCol w:w="2880"/>
+        <w:gridCol w:w="2880"/>
+      </w:tblGrid>
+      <w:tr>
+        <w:tc>
+          <w:tcPr>
+            <w:tcW w:type="dxa" w:w="2880"/>
+          </w:tcPr>
+          <w:p>
+            <w:r>
+              <w:rPr>
+                <w:b/>
+                <w:sz w:val="18"/>
+              </w:rPr>
+              <w:t>Tabla</w:t>
+            </w:r>
+          </w:p>
+        </w:tc>
+        <w:tc>
+          <w:tcPr>
+            <w:tcW w:type="dxa" w:w="2880"/>
+          </w:tcPr>
+          <w:p>
+            <w:r>
+              <w:rPr>
+                <w:b/>
+                <w:sz w:val="18"/>
+              </w:rPr>
+              <w:t>Contenido</w:t>
+            </w:r>
+          </w:p>
+        </w:tc>
+        <w:tc>
+          <w:tcPr>
+            <w:tcW w:type="dxa" w:w="2880"/>
+          </w:tcPr>
+          <w:p>
+            <w:r>
+              <w:rPr>
+                <w:b/>
+                <w:sz w:val="18"/>
+              </w:rPr>
+              <w:t>Filas</w:t>
+            </w:r>
+          </w:p>
+        </w:tc>
+      </w:tr>
+      <w:tr>
+        <w:tc>
+          <w:tcPr>
+            <w:tcW w:type="dxa" w:w="2880"/>
+          </w:tcPr>
+          <w:p>
+            <w:r>
+              <w:rPr>
+                <w:sz w:val="18"/>
+              </w:rPr>
+              <w:t>lobbyists</w:t>
+            </w:r>
+          </w:p>
+        </w:tc>
+        <w:tc>
+          <w:tcPr>
+            <w:tcW w:type="dxa" w:w="2880"/>
+          </w:tcPr>
+          <w:p>
+            <w:r>
+              <w:rPr>
+                <w:sz w:val="18"/>
+              </w:rPr>
+              <w:t>Una fila por organización inscrita: datos de inscripción, sede, personal y datos financieros. snapshot e in_latest_register indican de qué exportación procede la fila (4.3).</w:t>
+            </w:r>
+          </w:p>
+        </w:tc>
+        <w:tc>
+          <w:tcPr>
+            <w:tcW w:type="dxa" w:w="2880"/>
+          </w:tcPr>
+          <w:p>
+            <w:r>
+              <w:rPr>
+                <w:sz w:val="18"/>
+              </w:rPr>
+              <w:t>21.071</w:t>
+            </w:r>
+          </w:p>
+        </w:tc>
+      </w:tr>
+      <w:tr>
+        <w:tc>
+          <w:tcPr>
+            <w:tcW w:type="dxa" w:w="2880"/>
+          </w:tcPr>
+          <w:p>
+            <w:r>
+              <w:rPr>
+                <w:sz w:val="18"/>
+              </w:rPr>
+              <w:t>lobbyist_texts</w:t>
+            </w:r>
+          </w:p>
+        </w:tc>
+        <w:tc>
+          <w:tcPr>
+            <w:tcW w:type="dxa" w:w="2880"/>
+          </w:tcPr>
+          <w:p>
+            <w:r>
+              <w:rPr>
+                <w:sz w:val="18"/>
+              </w:rPr>
+              <w:t>Textos libres de la inscripción (objetivos, propuestas legislativas, actividades…).</w:t>
+            </w:r>
+          </w:p>
+        </w:tc>
+        <w:tc>
+          <w:tcPr>
+            <w:tcW w:type="dxa" w:w="2880"/>
+          </w:tcPr>
+          <w:p>
+            <w:r>
+              <w:rPr>
+                <w:sz w:val="18"/>
+              </w:rPr>
+              <w:t>21.071</w:t>
+            </w:r>
+          </w:p>
+        </w:tc>
+      </w:tr>
+      <w:tr>
+        <w:tc>
+          <w:tcPr>
+            <w:tcW w:type="dxa" w:w="2880"/>
+          </w:tcPr>
+          <w:p>
+            <w:r>
+              <w:rPr>
+                <w:sz w:val="18"/>
+              </w:rPr>
+              <w:t>lobbyist_interests / lobbyist_levels</w:t>
+            </w:r>
+          </w:p>
+        </w:tc>
+        <w:tc>
+          <w:tcPr>
+            <w:tcW w:type="dxa" w:w="2880"/>
+          </w:tcPr>
+          <w:p>
+            <w:r>
+              <w:rPr>
+                <w:sz w:val="18"/>
+              </w:rPr>
+              <w:t>Ámbitos de interés y niveles de actuación (una fila por valor).</w:t>
+            </w:r>
+          </w:p>
+        </w:tc>
+        <w:tc>
+          <w:tcPr>
+            <w:tcW w:type="dxa" w:w="2880"/>
+          </w:tcPr>
+          <w:p>
+            <w:r>
+              <w:rPr>
+                <w:sz w:val="18"/>
+              </w:rPr>
+              <w:t>199.155 / 45.728</w:t>
+            </w:r>
+          </w:p>
+        </w:tc>
+      </w:tr>
+      <w:tr>
+        <w:tc>
+          <w:tcPr>
+            <w:tcW w:type="dxa" w:w="2880"/>
+          </w:tcPr>
+          <w:p>
+            <w:r>
+              <w:rPr>
+                <w:sz w:val="18"/>
+              </w:rPr>
+              <w:t>lobbyist_grants / lobbyist_funding</w:t>
+            </w:r>
+          </w:p>
+        </w:tc>
+        <w:tc>
+          <w:tcPr>
+            <w:tcW w:type="dxa" w:w="2880"/>
+          </w:tcPr>
+          <w:p>
+            <w:r>
+              <w:rPr>
+                <w:sz w:val="18"/>
+              </w:rPr>
+              <w:t>Subvenciones de la UE y otras fuentes de financiación o aportaciones.</w:t>
+            </w:r>
+          </w:p>
+        </w:tc>
+        <w:tc>
+          <w:tcPr>
+            <w:tcW w:type="dxa" w:w="2880"/>
+          </w:tcPr>
+          <w:p>
+            <w:r>
+              <w:rPr>
+                <w:sz w:val="18"/>
+              </w:rPr>
+              <w:t>15.248 / 23.806</w:t>
+            </w:r>
+          </w:p>
+        </w:tc>
+      </w:tr>
+      <w:tr>
+        <w:tc>
+          <w:tcPr>
+            <w:tcW w:type="dxa" w:w="2880"/>
+          </w:tcPr>
+          <w:p>
+            <w:r>
+              <w:rPr>
+                <w:sz w:val="18"/>
+              </w:rPr>
+              <w:t>lobbyist_clients / lobbyist_intermediaries</w:t>
+            </w:r>
+          </w:p>
+        </w:tc>
+        <w:tc>
+          <w:tcPr>
+            <w:tcW w:type="dxa" w:w="2880"/>
+          </w:tcPr>
+          <w:p>
+            <w:r>
+              <w:rPr>
+                <w:sz w:val="18"/>
+              </w:rPr>
+              <w:t>Clientes (consultoras) e intermediarios contratados.</w:t>
+            </w:r>
+          </w:p>
+        </w:tc>
+        <w:tc>
+          <w:tcPr>
+            <w:tcW w:type="dxa" w:w="2880"/>
+          </w:tcPr>
+          <w:p>
+            <w:r>
+              <w:rPr>
+                <w:sz w:val="18"/>
+              </w:rPr>
+              <w:t>7.608 / 5.818</w:t>
+            </w:r>
+          </w:p>
+        </w:tc>
+      </w:tr>
+    </w:tbl>
+    <w:p>
+      <w:pPr>
+        <w:spacing w:after="80"/>
+      </w:pPr>
+    </w:p>
+    <w:p>
+      <w:pPr>
+        <w:spacing w:after="80"/>
+      </w:pPr>
+      <w:r>
+        <w:t>Cruce con la actividad (CSV de 2_actividad/, unidos por lobbyist_id). Reuniones: register_id_in_source es el número del Registro que la propia fuente indica para ese asistente (vacío si no lo indica o si las listas de nombres y números no tienen la misma longitud); organisation_id es la identificación final y match_method su método: register_id (número de la fuente en esa fila), name_seen_with_register_id (el mismo nombre aparece con número en otra reunión), id_in_name, name, reviewed_duplicate o unregistered (4.1). procedure_declared es el procedimiento declarado; procedure_reference y procedure_source incluyen los inferidos (4.4). Consultas: tr_number es el número declarado en la respuesta; lobbyist_id y match_method, la identificación final. procedure_reference y stage son la asignación propia de cada publicación a un procedimiento. Para usar solo enlaces dados por las fuentes, filtrar match_method = 'register_id'.</w:t>
       </w:r>
     </w:p>
     <w:p>
@@ -1911,7 +2202,7 @@
               <w:rPr>
                 <w:sz w:val="18"/>
               </w:rPr>
-              <w:t>4.572</w:t>
+              <w:t>4.601</w:t>
             </w:r>
           </w:p>
         </w:tc>
@@ -2023,7 +2314,35 @@
               <w:rPr>
                 <w:sz w:val="18"/>
               </w:rPr>
-              <w:t>92.886</w:t>
+              <w:t>93.792</w:t>
+            </w:r>
+          </w:p>
+        </w:tc>
+      </w:tr>
+      <w:tr>
+        <w:tc>
+          <w:tcPr>
+            <w:tcW w:type="dxa" w:w="4320"/>
+          </w:tcPr>
+          <w:p>
+            <w:r>
+              <w:rPr>
+                <w:sz w:val="18"/>
+              </w:rPr>
+              <w:t>… de ellas con número del Registro indicado en la fuente</w:t>
+            </w:r>
+          </w:p>
+        </w:tc>
+        <w:tc>
+          <w:tcPr>
+            <w:tcW w:type="dxa" w:w="4320"/>
+          </w:tcPr>
+          <w:p>
+            <w:r>
+              <w:rPr>
+                <w:sz w:val="18"/>
+              </w:rPr>
+              <w:t>50.530</w:t>
             </w:r>
           </w:p>
         </w:tc>
@@ -2107,7 +2426,7 @@
               <w:rPr>
                 <w:sz w:val="18"/>
               </w:rPr>
-              <w:t>5.517</w:t>
+              <w:t>8.613</w:t>
             </w:r>
           </w:p>
         </w:tc>

</xml_diff>